<commit_message>
Queja Bartek: nombre completo de la gerente y marcas DELISOYA y SRB
Co-Authored-By: Claude Opus 5.5 <noreply@anthropic.com>
Claude-Session: https://claude.ai/code/session_01Ls5dNjYBLNjXxuGTDk7v3H
</commit_message>
<xml_diff>
--- a/carta-reclamo/Queja_Bartek_Jefatura_PeruCompras.docx
+++ b/carta-reclamo/Queja_Bartek_Jefatura_PeruCompras.docx
@@ -191,7 +191,7 @@
           <w:bCs/>
           <w:b/>
         </w:rPr>
-        <w:t xml:space="preserve">FAVIOLA ORIHUELA PIMENTEL</w:t>
+        <w:t xml:space="preserve">FAVIOLA MATILDE ORIHUELA PIMENTEL</w:t>
       </w:r>
       <w:r>
         <w:t xml:space="preserve">, identificada con DNI N.°</w:t>
@@ -293,7 +293,7 @@
         <w:t xml:space="preserve"> </w:t>
       </w:r>
       <w:r>
-        <w:t xml:space="preserve">Somos representante de marca acreditado de</w:t>
+        <w:t xml:space="preserve">Somos representante de marca acreditado de las marcas</w:t>
       </w:r>
       <w:r>
         <w:t xml:space="preserve"> </w:t>
@@ -338,7 +338,65 @@
         <w:t xml:space="preserve">Formato N.° 397-2025-ARM</w:t>
       </w:r>
       <w:r>
-        <w:t xml:space="preserve">, del 10 de junio de 2025.</w:t>
+        <w:t xml:space="preserve">, del 10 de junio de 2025, así como de las marcas</w:t>
+      </w:r>
+      <w:r>
+        <w:t xml:space="preserve"> </w:t>
+      </w:r>
+      <w:r>
+        <w:rPr>
+          <w:bCs/>
+          <w:b/>
+        </w:rPr>
+        <w:t xml:space="preserve">DELISOYA</w:t>
+      </w:r>
+      <w:r>
+        <w:t xml:space="preserve"> </w:t>
+      </w:r>
+      <w:r>
+        <w:t xml:space="preserve">y</w:t>
+      </w:r>
+      <w:r>
+        <w:t xml:space="preserve"> </w:t>
+      </w:r>
+      <w:r>
+        <w:rPr>
+          <w:bCs/>
+          <w:b/>
+        </w:rPr>
+        <w:t xml:space="preserve">SRB</w:t>
+      </w:r>
+      <w:r>
+        <w:t xml:space="preserve">. El Acuerdo de Adhesión es</w:t>
+      </w:r>
+      <w:r>
+        <w:t xml:space="preserve"> </w:t>
+      </w:r>
+      <w:r>
+        <w:rPr>
+          <w:bCs/>
+          <w:b/>
+        </w:rPr>
+        <w:t xml:space="preserve">uno solo</w:t>
+      </w:r>
+      <w:r>
+        <w:t xml:space="preserve"> </w:t>
+      </w:r>
+      <w:r>
+        <w:t xml:space="preserve">y lo suscribe SERVICIOS BARTEK E.I.R.L. como representante de marca, por lo que su falta de formalización</w:t>
+      </w:r>
+      <w:r>
+        <w:t xml:space="preserve"> </w:t>
+      </w:r>
+      <w:r>
+        <w:rPr>
+          <w:bCs/>
+          <w:b/>
+        </w:rPr>
+        <w:t xml:space="preserve">afecta a todas nuestras marcas</w:t>
+      </w:r>
+      <w:r>
+        <w:t xml:space="preserve">.</w:t>
       </w:r>
     </w:p>
     <w:p>
@@ -973,6 +1031,48 @@
         <w:t xml:space="preserve">por una demora que no nos es imputable</w:t>
       </w:r>
       <w:r>
+        <w:t xml:space="preserve">. Según la propia DCEME, mientras no culmine el trámite</w:t>
+      </w:r>
+      <w:r>
+        <w:t xml:space="preserve"> </w:t>
+      </w:r>
+      <w:r>
+        <w:rPr>
+          <w:bCs/>
+          <w:b/>
+        </w:rPr>
+        <w:t xml:space="preserve">no podemos continuar con la gestión de nuestras Fichas-Producto</w:t>
+      </w:r>
+      <w:r>
+        <w:t xml:space="preserve">, lo que alcanza también a las marcas</w:t>
+      </w:r>
+      <w:r>
+        <w:t xml:space="preserve"> </w:t>
+      </w:r>
+      <w:r>
+        <w:rPr>
+          <w:bCs/>
+          <w:b/>
+        </w:rPr>
+        <w:t xml:space="preserve">DELISOYA</w:t>
+      </w:r>
+      <w:r>
+        <w:t xml:space="preserve"> </w:t>
+      </w:r>
+      <w:r>
+        <w:t xml:space="preserve">y</w:t>
+      </w:r>
+      <w:r>
+        <w:t xml:space="preserve"> </w:t>
+      </w:r>
+      <w:r>
+        <w:rPr>
+          <w:bCs/>
+          <w:b/>
+        </w:rPr>
+        <w:t xml:space="preserve">SRB</w:t>
+      </w:r>
+      <w:r>
         <w:t xml:space="preserve">.</w:t>
       </w:r>
     </w:p>
@@ -1134,7 +1234,23 @@
         <w:t xml:space="preserve">3 fichas SQP-MIKROVAL</w:t>
       </w:r>
       <w:r>
-        <w:t xml:space="preserve">, sin esperar al siguiente periodo del cronograma.</w:t>
+        <w:t xml:space="preserve">, sin esperar al siguiente periodo del cronograma, y</w:t>
+      </w:r>
+      <w:r>
+        <w:t xml:space="preserve"> </w:t>
+      </w:r>
+      <w:r>
+        <w:rPr>
+          <w:bCs/>
+          <w:b/>
+        </w:rPr>
+        <w:t xml:space="preserve">restablecer la gestión de las Fichas-Producto de todas nuestras marcas</w:t>
+      </w:r>
+      <w:r>
+        <w:t xml:space="preserve"> </w:t>
+      </w:r>
+      <w:r>
+        <w:t xml:space="preserve">(MOBIS, SQP-MIKROVAL, DELISOYA y SRB).</w:t>
       </w:r>
     </w:p>
     <w:p>
@@ -1348,7 +1464,7 @@
         <w:br/>
       </w:r>
       <w:r>
-        <w:t xml:space="preserve">Gerente: Faviola Orihuela Pimentel</w:t>
+        <w:t xml:space="preserve">Gerente: Faviola Matilde Orihuela Pimentel</w:t>
       </w:r>
       <w:r>
         <w:br/>

</xml_diff>

<commit_message>
Queja Bartek: DELISOYA y SRB como argumento de trato distinto
Co-Authored-By: Claude Opus 5.5 <noreply@anthropic.com>
Claude-Session: https://claude.ai/code/session_01Ls5dNjYBLNjXxuGTDk7v3H
</commit_message>
<xml_diff>
--- a/carta-reclamo/Queja_Bartek_Jefatura_PeruCompras.docx
+++ b/carta-reclamo/Queja_Bartek_Jefatura_PeruCompras.docx
@@ -383,17 +383,17 @@
         <w:t xml:space="preserve"> </w:t>
       </w:r>
       <w:r>
-        <w:t xml:space="preserve">y lo suscribe SERVICIOS BARTEK E.I.R.L. como representante de marca, por lo que su falta de formalización</w:t>
-      </w:r>
-      <w:r>
-        <w:t xml:space="preserve"> </w:t>
-      </w:r>
-      <w:r>
-        <w:rPr>
-          <w:bCs/>
-          <w:b/>
-        </w:rPr>
-        <w:t xml:space="preserve">afecta a todas nuestras marcas</w:t>
+        <w:t xml:space="preserve">y lo suscribe SERVICIOS BARTEK E.I.R.L. como representante de marca,</w:t>
+      </w:r>
+      <w:r>
+        <w:t xml:space="preserve"> </w:t>
+      </w:r>
+      <w:r>
+        <w:rPr>
+          <w:bCs/>
+          <w:b/>
+        </w:rPr>
+        <w:t xml:space="preserve">no cada marca por separado</w:t>
       </w:r>
       <w:r>
         <w:t xml:space="preserve">.</w:t>
@@ -1031,20 +1031,26 @@
         <w:t xml:space="preserve">por una demora que no nos es imputable</w:t>
       </w:r>
       <w:r>
-        <w:t xml:space="preserve">. Según la propia DCEME, mientras no culmine el trámite</w:t>
-      </w:r>
-      <w:r>
-        <w:t xml:space="preserve"> </w:t>
-      </w:r>
-      <w:r>
-        <w:rPr>
-          <w:bCs/>
-          <w:b/>
-        </w:rPr>
-        <w:t xml:space="preserve">no podemos continuar con la gestión de nuestras Fichas-Producto</w:t>
-      </w:r>
-      <w:r>
-        <w:t xml:space="preserve">, lo que alcanza también a las marcas</w:t>
+        <w:t xml:space="preserve">.</w:t>
+      </w:r>
+    </w:p>
+    <w:p>
+      <w:pPr>
+        <w:pStyle w:val="BodyText"/>
+        <w:jc w:val="both"/>
+      </w:pPr>
+      <w:r>
+        <w:rPr>
+          <w:bCs/>
+          <w:b/>
+        </w:rPr>
+        <w:t xml:space="preserve">2.6. Hay un trato distinto sin justificación.</w:t>
+      </w:r>
+      <w:r>
+        <w:t xml:space="preserve"> </w:t>
+      </w:r>
+      <w:r>
+        <w:t xml:space="preserve">Nuestras marcas</w:t>
       </w:r>
       <w:r>
         <w:t xml:space="preserve"> </w:t>
@@ -1073,7 +1079,55 @@
         <w:t xml:space="preserve">SRB</w:t>
       </w:r>
       <w:r>
-        <w:t xml:space="preserve">.</w:t>
+        <w:t xml:space="preserve"> </w:t>
+      </w:r>
+      <w:r>
+        <w:t xml:space="preserve">dependen del</w:t>
+      </w:r>
+      <w:r>
+        <w:t xml:space="preserve"> </w:t>
+      </w:r>
+      <w:r>
+        <w:rPr>
+          <w:bCs/>
+          <w:b/>
+        </w:rPr>
+        <w:t xml:space="preserve">mismo Acuerdo de Adhesión</w:t>
+      </w:r>
+      <w:r>
+        <w:t xml:space="preserve"> </w:t>
+      </w:r>
+      <w:r>
+        <w:t xml:space="preserve">pendiente y, sin embargo,</w:t>
+      </w:r>
+      <w:r>
+        <w:t xml:space="preserve"> </w:t>
+      </w:r>
+      <w:r>
+        <w:rPr>
+          <w:bCs/>
+          <w:b/>
+        </w:rPr>
+        <w:t xml:space="preserve">operan con normalidad</w:t>
+      </w:r>
+      <w:r>
+        <w:t xml:space="preserve">. Si la falta de formalización fuera la causa, afectaría por igual a todas nuestras marcas. Que solo MOBIS y SQP-MIKROVAL estén bloqueadas vulnera el principio de</w:t>
+      </w:r>
+      <w:r>
+        <w:t xml:space="preserve"> </w:t>
+      </w:r>
+      <w:r>
+        <w:rPr>
+          <w:bCs/>
+          <w:b/>
+        </w:rPr>
+        <w:t xml:space="preserve">igualdad de trato</w:t>
+      </w:r>
+      <w:r>
+        <w:t xml:space="preserve"> </w:t>
+      </w:r>
+      <w:r>
+        <w:t xml:space="preserve">y exige una explicación.</w:t>
       </w:r>
     </w:p>
     <w:bookmarkEnd w:id="21"/>
@@ -1234,23 +1288,7 @@
         <w:t xml:space="preserve">3 fichas SQP-MIKROVAL</w:t>
       </w:r>
       <w:r>
-        <w:t xml:space="preserve">, sin esperar al siguiente periodo del cronograma, y</w:t>
-      </w:r>
-      <w:r>
-        <w:t xml:space="preserve"> </w:t>
-      </w:r>
-      <w:r>
-        <w:rPr>
-          <w:bCs/>
-          <w:b/>
-        </w:rPr>
-        <w:t xml:space="preserve">restablecer la gestión de las Fichas-Producto de todas nuestras marcas</w:t>
-      </w:r>
-      <w:r>
-        <w:t xml:space="preserve"> </w:t>
-      </w:r>
-      <w:r>
-        <w:t xml:space="preserve">(MOBIS, SQP-MIKROVAL, DELISOYA y SRB).</w:t>
+        <w:t xml:space="preserve">, sin esperar al siguiente periodo del cronograma.</w:t>
       </w:r>
     </w:p>
     <w:p>
@@ -1319,6 +1357,7 @@
           <w:numId w:val="1003"/>
         </w:numPr>
         <w:pStyle w:val="Compact"/>
+        <w:jc w:val="both"/>
       </w:pPr>
       <w:r>
         <w:rPr>
@@ -1331,7 +1370,23 @@
         <w:t xml:space="preserve"> </w:t>
       </w:r>
       <w:r>
-        <w:t xml:space="preserve">nuestra Carta N.° 16102026-1.</w:t>
+        <w:t xml:space="preserve">nuestra Carta N.° 16102026-1, explicando</w:t>
+      </w:r>
+      <w:r>
+        <w:t xml:space="preserve"> </w:t>
+      </w:r>
+      <w:r>
+        <w:rPr>
+          <w:bCs/>
+          <w:b/>
+        </w:rPr>
+        <w:t xml:space="preserve">por qué MOBIS y SQP-MIKROVAL reciben un trato distinto</w:t>
+      </w:r>
+      <w:r>
+        <w:t xml:space="preserve"> </w:t>
+      </w:r>
+      <w:r>
+        <w:t xml:space="preserve">al de nuestras marcas DELISOYA y SRB, que dependen del mismo Acuerdo de Adhesión.</w:t>
       </w:r>
     </w:p>
     <w:p>

</xml_diff>

<commit_message>
Queja Bartek: retirar DELISOYA y SRB para no afectar esas marcas
Co-Authored-By: Claude Opus 5.5 <noreply@anthropic.com>
Claude-Session: https://claude.ai/code/session_01Ls5dNjYBLNjXxuGTDk7v3H
</commit_message>
<xml_diff>
--- a/carta-reclamo/Queja_Bartek_Jefatura_PeruCompras.docx
+++ b/carta-reclamo/Queja_Bartek_Jefatura_PeruCompras.docx
@@ -338,65 +338,7 @@
         <w:t xml:space="preserve">Formato N.° 397-2025-ARM</w:t>
       </w:r>
       <w:r>
-        <w:t xml:space="preserve">, del 10 de junio de 2025, así como de las marcas</w:t>
-      </w:r>
-      <w:r>
-        <w:t xml:space="preserve"> </w:t>
-      </w:r>
-      <w:r>
-        <w:rPr>
-          <w:bCs/>
-          <w:b/>
-        </w:rPr>
-        <w:t xml:space="preserve">DELISOYA</w:t>
-      </w:r>
-      <w:r>
-        <w:t xml:space="preserve"> </w:t>
-      </w:r>
-      <w:r>
-        <w:t xml:space="preserve">y</w:t>
-      </w:r>
-      <w:r>
-        <w:t xml:space="preserve"> </w:t>
-      </w:r>
-      <w:r>
-        <w:rPr>
-          <w:bCs/>
-          <w:b/>
-        </w:rPr>
-        <w:t xml:space="preserve">SRB</w:t>
-      </w:r>
-      <w:r>
-        <w:t xml:space="preserve">. El Acuerdo de Adhesión es</w:t>
-      </w:r>
-      <w:r>
-        <w:t xml:space="preserve"> </w:t>
-      </w:r>
-      <w:r>
-        <w:rPr>
-          <w:bCs/>
-          <w:b/>
-        </w:rPr>
-        <w:t xml:space="preserve">uno solo</w:t>
-      </w:r>
-      <w:r>
-        <w:t xml:space="preserve"> </w:t>
-      </w:r>
-      <w:r>
-        <w:t xml:space="preserve">y lo suscribe SERVICIOS BARTEK E.I.R.L. como representante de marca,</w:t>
-      </w:r>
-      <w:r>
-        <w:t xml:space="preserve"> </w:t>
-      </w:r>
-      <w:r>
-        <w:rPr>
-          <w:bCs/>
-          <w:b/>
-        </w:rPr>
-        <w:t xml:space="preserve">no cada marca por separado</w:t>
-      </w:r>
-      <w:r>
-        <w:t xml:space="preserve">.</w:t>
+        <w:t xml:space="preserve">, del 10 de junio de 2025.</w:t>
       </w:r>
     </w:p>
     <w:p>
@@ -1034,102 +976,6 @@
         <w:t xml:space="preserve">.</w:t>
       </w:r>
     </w:p>
-    <w:p>
-      <w:pPr>
-        <w:pStyle w:val="BodyText"/>
-        <w:jc w:val="both"/>
-      </w:pPr>
-      <w:r>
-        <w:rPr>
-          <w:bCs/>
-          <w:b/>
-        </w:rPr>
-        <w:t xml:space="preserve">2.6. Hay un trato distinto sin justificación.</w:t>
-      </w:r>
-      <w:r>
-        <w:t xml:space="preserve"> </w:t>
-      </w:r>
-      <w:r>
-        <w:t xml:space="preserve">Nuestras marcas</w:t>
-      </w:r>
-      <w:r>
-        <w:t xml:space="preserve"> </w:t>
-      </w:r>
-      <w:r>
-        <w:rPr>
-          <w:bCs/>
-          <w:b/>
-        </w:rPr>
-        <w:t xml:space="preserve">DELISOYA</w:t>
-      </w:r>
-      <w:r>
-        <w:t xml:space="preserve"> </w:t>
-      </w:r>
-      <w:r>
-        <w:t xml:space="preserve">y</w:t>
-      </w:r>
-      <w:r>
-        <w:t xml:space="preserve"> </w:t>
-      </w:r>
-      <w:r>
-        <w:rPr>
-          <w:bCs/>
-          <w:b/>
-        </w:rPr>
-        <w:t xml:space="preserve">SRB</w:t>
-      </w:r>
-      <w:r>
-        <w:t xml:space="preserve"> </w:t>
-      </w:r>
-      <w:r>
-        <w:t xml:space="preserve">dependen del</w:t>
-      </w:r>
-      <w:r>
-        <w:t xml:space="preserve"> </w:t>
-      </w:r>
-      <w:r>
-        <w:rPr>
-          <w:bCs/>
-          <w:b/>
-        </w:rPr>
-        <w:t xml:space="preserve">mismo Acuerdo de Adhesión</w:t>
-      </w:r>
-      <w:r>
-        <w:t xml:space="preserve"> </w:t>
-      </w:r>
-      <w:r>
-        <w:t xml:space="preserve">pendiente y, sin embargo,</w:t>
-      </w:r>
-      <w:r>
-        <w:t xml:space="preserve"> </w:t>
-      </w:r>
-      <w:r>
-        <w:rPr>
-          <w:bCs/>
-          <w:b/>
-        </w:rPr>
-        <w:t xml:space="preserve">operan con normalidad</w:t>
-      </w:r>
-      <w:r>
-        <w:t xml:space="preserve">. Si la falta de formalización fuera la causa, afectaría por igual a todas nuestras marcas. Que solo MOBIS y SQP-MIKROVAL estén bloqueadas vulnera el principio de</w:t>
-      </w:r>
-      <w:r>
-        <w:t xml:space="preserve"> </w:t>
-      </w:r>
-      <w:r>
-        <w:rPr>
-          <w:bCs/>
-          <w:b/>
-        </w:rPr>
-        <w:t xml:space="preserve">igualdad de trato</w:t>
-      </w:r>
-      <w:r>
-        <w:t xml:space="preserve"> </w:t>
-      </w:r>
-      <w:r>
-        <w:t xml:space="preserve">y exige una explicación.</w:t>
-      </w:r>
-    </w:p>
     <w:bookmarkEnd w:id="21"/>
     <w:bookmarkStart w:id="37" w:name="petitorio"/>
     <w:p>
@@ -1357,7 +1203,6 @@
           <w:numId w:val="1003"/>
         </w:numPr>
         <w:pStyle w:val="Compact"/>
-        <w:jc w:val="both"/>
       </w:pPr>
       <w:r>
         <w:rPr>
@@ -1370,23 +1215,7 @@
         <w:t xml:space="preserve"> </w:t>
       </w:r>
       <w:r>
-        <w:t xml:space="preserve">nuestra Carta N.° 16102026-1, explicando</w:t>
-      </w:r>
-      <w:r>
-        <w:t xml:space="preserve"> </w:t>
-      </w:r>
-      <w:r>
-        <w:rPr>
-          <w:bCs/>
-          <w:b/>
-        </w:rPr>
-        <w:t xml:space="preserve">por qué MOBIS y SQP-MIKROVAL reciben un trato distinto</w:t>
-      </w:r>
-      <w:r>
-        <w:t xml:space="preserve"> </w:t>
-      </w:r>
-      <w:r>
-        <w:t xml:space="preserve">al de nuestras marcas DELISOYA y SRB, que dependen del mismo Acuerdo de Adhesión.</w:t>
+        <w:t xml:space="preserve">nuestra Carta N.° 16102026-1.</w:t>
       </w:r>
     </w:p>
     <w:p>

</xml_diff>

<commit_message>
Queja Bartek: 24 competidores de Mobiliario con acuerdo formalizado (Anexo 3)
Co-Authored-By: Claude Opus 5.5 <noreply@anthropic.com>
Claude-Session: https://claude.ai/code/session_01Ls5dNjYBLNjXxuGTDk7v3H
</commit_message>
<xml_diff>
--- a/carta-reclamo/Queja_Bartek_Jefatura_PeruCompras.docx
+++ b/carta-reclamo/Queja_Bartek_Jefatura_PeruCompras.docx
@@ -107,7 +107,7 @@
         <w:pStyle w:val="Compact"/>
       </w:pPr>
       <w:r>
-        <w:t xml:space="preserve">Carta N.° 16102026-1-SERVICIOS BARTEK E.I.R.L., del 16 de octubre de 2026 (Anexo 3).</w:t>
+        <w:t xml:space="preserve">Carta N.° 16102026-1-SERVICIOS BARTEK E.I.R.L., del 16 de octubre de 2026 (Anexo 4).</w:t>
       </w:r>
     </w:p>
     <w:p>
@@ -149,6 +149,19 @@
       </w:r>
     </w:p>
     <w:p>
+      <w:pPr>
+        <w:numPr>
+          <w:ilvl w:val="0"/>
+          <w:numId w:val="1001"/>
+        </w:numPr>
+        <w:pStyle w:val="Compact"/>
+        <w:jc w:val="both"/>
+      </w:pPr>
+      <w:r>
+        <w:t xml:space="preserve">Listado oficial de Representantes de Marca con Acuerdo de Adhesión, publicado por PERÚ COMPRAS, actualizado al 22 de octubre de 2026 (Anexo 3).</w:t>
+      </w:r>
+    </w:p>
+    <w:p>
       <w:r>
         <w:pict>
           <v:rect style="width:0;height:1.5pt" o:hralign="center" o:hrstd="t" o:hr="t"/>
@@ -638,7 +651,7 @@
         <w:t xml:space="preserve"> </w:t>
       </w:r>
       <w:r>
-        <w:t xml:space="preserve">(Anexo 3), pidiendo la formalización y la habilitación de nuestras fichas en</w:t>
+        <w:t xml:space="preserve">(Anexo 4), pidiendo la formalización y la habilitación de nuestras fichas en</w:t>
       </w:r>
       <w:r>
         <w:t xml:space="preserve"> </w:t>
@@ -974,6 +987,157 @@
       </w:r>
       <w:r>
         <w:t xml:space="preserve">.</w:t>
+      </w:r>
+    </w:p>
+    <w:p>
+      <w:pPr>
+        <w:pStyle w:val="BodyText"/>
+        <w:jc w:val="both"/>
+      </w:pPr>
+      <w:r>
+        <w:rPr>
+          <w:bCs/>
+          <w:b/>
+        </w:rPr>
+        <w:t xml:space="preserve">2.6. A nuestros competidores sí se les formalizó el acuerdo.</w:t>
+      </w:r>
+      <w:r>
+        <w:t xml:space="preserve"> </w:t>
+      </w:r>
+      <w:r>
+        <w:t xml:space="preserve">Según el</w:t>
+      </w:r>
+      <w:r>
+        <w:t xml:space="preserve"> </w:t>
+      </w:r>
+      <w:r>
+        <w:rPr>
+          <w:bCs/>
+          <w:b/>
+        </w:rPr>
+        <w:t xml:space="preserve">listado oficial</w:t>
+      </w:r>
+      <w:r>
+        <w:t xml:space="preserve"> </w:t>
+      </w:r>
+      <w:r>
+        <w:t xml:space="preserve">de Representantes de Marca con Acuerdo de Adhesión publicado por PERÚ COMPRAS,</w:t>
+      </w:r>
+      <w:r>
+        <w:t xml:space="preserve"> </w:t>
+      </w:r>
+      <w:r>
+        <w:rPr>
+          <w:bCs/>
+          <w:b/>
+        </w:rPr>
+        <w:t xml:space="preserve">actualizado al 22 de octubre de 2026</w:t>
+      </w:r>
+      <w:r>
+        <w:t xml:space="preserve"> </w:t>
+      </w:r>
+      <w:r>
+        <w:t xml:space="preserve">(Anexo 3), la Entidad ya formalizó el acuerdo de</w:t>
+      </w:r>
+      <w:r>
+        <w:t xml:space="preserve"> </w:t>
+      </w:r>
+      <w:r>
+        <w:rPr>
+          <w:bCs/>
+          <w:b/>
+        </w:rPr>
+        <w:t xml:space="preserve">veinticuatro (24) representantes de marca</w:t>
+      </w:r>
+      <w:r>
+        <w:t xml:space="preserve"> </w:t>
+      </w:r>
+      <w:r>
+        <w:t xml:space="preserve">del Catálogo Electrónico de</w:t>
+      </w:r>
+      <w:r>
+        <w:t xml:space="preserve"> </w:t>
+      </w:r>
+      <w:r>
+        <w:rPr>
+          <w:bCs/>
+          <w:b/>
+        </w:rPr>
+        <w:t xml:space="preserve">Mobiliario en General (EXT-CE-2025-11)</w:t>
+      </w:r>
+      <w:r>
+        <w:t xml:space="preserve">, en las</w:t>
+      </w:r>
+      <w:r>
+        <w:t xml:space="preserve"> </w:t>
+      </w:r>
+      <w:r>
+        <w:rPr>
+          <w:bCs/>
+          <w:b/>
+        </w:rPr>
+        <w:t xml:space="preserve">mismas categorías</w:t>
+      </w:r>
+      <w:r>
+        <w:t xml:space="preserve"> </w:t>
+      </w:r>
+      <w:r>
+        <w:t xml:space="preserve">de nuestra acreditación, incluidas marcas competidoras como</w:t>
+      </w:r>
+      <w:r>
+        <w:t xml:space="preserve"> </w:t>
+      </w:r>
+      <w:r>
+        <w:rPr>
+          <w:bCs/>
+          <w:b/>
+        </w:rPr>
+        <w:t xml:space="preserve">MOBISEAT</w:t>
+      </w:r>
+      <w:r>
+        <w:t xml:space="preserve"> </w:t>
+      </w:r>
+      <w:r>
+        <w:t xml:space="preserve">y</w:t>
+      </w:r>
+      <w:r>
+        <w:t xml:space="preserve"> </w:t>
+      </w:r>
+      <w:r>
+        <w:rPr>
+          <w:bCs/>
+          <w:b/>
+        </w:rPr>
+        <w:t xml:space="preserve">EC ERGOCORP</w:t>
+      </w:r>
+      <w:r>
+        <w:t xml:space="preserve">.</w:t>
+      </w:r>
+      <w:r>
+        <w:t xml:space="preserve"> </w:t>
+      </w:r>
+      <w:r>
+        <w:rPr>
+          <w:bCs/>
+          <w:b/>
+        </w:rPr>
+        <w:t xml:space="preserve">SERVICIOS BARTEK E.I.R.L. no figura</w:t>
+      </w:r>
+      <w:r>
+        <w:t xml:space="preserve">, pese a haber cumplido el mismo plazo. Esto vulnera el principio de</w:t>
+      </w:r>
+      <w:r>
+        <w:t xml:space="preserve"> </w:t>
+      </w:r>
+      <w:r>
+        <w:rPr>
+          <w:bCs/>
+          <w:b/>
+        </w:rPr>
+        <w:t xml:space="preserve">igualdad de trato</w:t>
+      </w:r>
+      <w:r>
+        <w:t xml:space="preserve">: mientras nuestro trámite está paralizado, los proveedores ofertan las marcas de la competencia y no la nuestra.</w:t>
       </w:r>
     </w:p>
     <w:bookmarkEnd w:id="21"/>
@@ -1203,6 +1367,7 @@
           <w:numId w:val="1003"/>
         </w:numPr>
         <w:pStyle w:val="Compact"/>
+        <w:jc w:val="both"/>
       </w:pPr>
       <w:r>
         <w:rPr>
@@ -1215,7 +1380,36 @@
         <w:t xml:space="preserve"> </w:t>
       </w:r>
       <w:r>
-        <w:t xml:space="preserve">nuestra Carta N.° 16102026-1.</w:t>
+        <w:t xml:space="preserve">nuestra Carta N.° 16102026-1, informando</w:t>
+      </w:r>
+      <w:r>
+        <w:t xml:space="preserve"> </w:t>
+      </w:r>
+      <w:r>
+        <w:rPr>
+          <w:bCs/>
+          <w:b/>
+        </w:rPr>
+        <w:t xml:space="preserve">qué criterio u orden</w:t>
+      </w:r>
+      <w:r>
+        <w:t xml:space="preserve"> </w:t>
+      </w:r>
+      <w:r>
+        <w:t xml:space="preserve">se ha seguido para formalizar los Acuerdos de Adhesión y</w:t>
+      </w:r>
+      <w:r>
+        <w:t xml:space="preserve"> </w:t>
+      </w:r>
+      <w:r>
+        <w:rPr>
+          <w:bCs/>
+          <w:b/>
+        </w:rPr>
+        <w:t xml:space="preserve">por qué el nuestro no ha sido formalizado</w:t>
+      </w:r>
+      <w:r>
+        <w:t xml:space="preserve">, cuando sí lo fue el de otros representantes de marca del mismo catálogo.</w:t>
       </w:r>
     </w:p>
     <w:p>
@@ -1421,6 +1615,7 @@
           <w:numId w:val="1004"/>
         </w:numPr>
         <w:pStyle w:val="Compact"/>
+        <w:jc w:val="both"/>
       </w:pPr>
       <w:r>
         <w:rPr>
@@ -1428,6 +1623,28 @@
           <w:b/>
         </w:rPr>
         <w:t xml:space="preserve">Anexo 3:</w:t>
+      </w:r>
+      <w:r>
+        <w:t xml:space="preserve"> </w:t>
+      </w:r>
+      <w:r>
+        <w:t xml:space="preserve">Listado oficial de Representantes de Marca con Acuerdo de Adhesión – Mobiliario en General (al 22/10/2026).</w:t>
+      </w:r>
+    </w:p>
+    <w:p>
+      <w:pPr>
+        <w:numPr>
+          <w:ilvl w:val="0"/>
+          <w:numId w:val="1004"/>
+        </w:numPr>
+        <w:pStyle w:val="Compact"/>
+      </w:pPr>
+      <w:r>
+        <w:rPr>
+          <w:bCs/>
+          <w:b/>
+        </w:rPr>
+        <w:t xml:space="preserve">Anexo 4:</w:t>
       </w:r>
       <w:r>
         <w:t xml:space="preserve"> </w:t>
@@ -1649,6 +1866,1321 @@
         </w:drawing>
       </w:r>
     </w:p>
+    <w:p>
+      <w:r>
+        <w:br w:type="page"/>
+      </w:r>
+    </w:p>
+    <w:p>
+      <w:pPr>
+        <w:pStyle w:val="BodyText"/>
+        <w:jc w:val="both"/>
+      </w:pPr>
+      <w:r>
+        <w:rPr>
+          <w:bCs/>
+          <w:b/>
+        </w:rPr>
+        <w:t xml:space="preserve">ANEXO 3 – Listado oficial de Representantes de Marca con Acuerdo de Adhesión – Mobiliario en General (EXT-CE-2025-11), actualizado al 22/10/2026</w:t>
+      </w:r>
+    </w:p>
+    <w:p>
+      <w:pPr>
+        <w:pStyle w:val="BodyText"/>
+        <w:jc w:val="both"/>
+      </w:pPr>
+      <w:r>
+        <w:t xml:space="preserve">Fuente: PERÚ COMPRAS, central.perucompras.gob.pe/acuerdos-marco/representante-marca-acuerdo-adhesion.php (122 registros, resumidos por representante de marca).</w:t>
+      </w:r>
+      <w:r>
+        <w:t xml:space="preserve"> </w:t>
+      </w:r>
+      <w:r>
+        <w:rPr>
+          <w:bCs/>
+          <w:b/>
+        </w:rPr>
+        <w:t xml:space="preserve">SERVICIOS BARTEK E.I.R.L. (RUC 20610900551) no figura.</w:t>
+      </w:r>
+    </w:p>
+    <w:tbl>
+      <w:tblPr>
+        <w:tblStyle w:val="Table"/>
+        <w:tblW w:type="pct" w:w="5000"/>
+        <w:tblLook w:firstRow="1" w:lastRow="0" w:firstColumn="0" w:lastColumn="0" w:noHBand="0" w:noVBand="0" w:val="0020"/>
+        <w:jc w:val="start"/>
+      </w:tblPr>
+      <w:tblGrid>
+        <w:gridCol w:w="424"/>
+        <w:gridCol w:w="1272"/>
+        <w:gridCol w:w="3394"/>
+        <w:gridCol w:w="2828"/>
+      </w:tblGrid>
+      <w:tr>
+        <w:trPr>
+          <w:tblHeader w:val="true"/>
+        </w:trPr>
+        <w:tc>
+          <w:tcPr/>
+          <w:p>
+            <w:pPr>
+              <w:pStyle w:val="Compact"/>
+              <w:jc w:val="left"/>
+            </w:pPr>
+            <w:r>
+              <w:t xml:space="preserve">N.°</w:t>
+            </w:r>
+          </w:p>
+        </w:tc>
+        <w:tc>
+          <w:tcPr/>
+          <w:p>
+            <w:pPr>
+              <w:pStyle w:val="Compact"/>
+              <w:jc w:val="left"/>
+            </w:pPr>
+            <w:r>
+              <w:t xml:space="preserve">RUC</w:t>
+            </w:r>
+          </w:p>
+        </w:tc>
+        <w:tc>
+          <w:tcPr/>
+          <w:p>
+            <w:pPr>
+              <w:pStyle w:val="Compact"/>
+              <w:jc w:val="left"/>
+            </w:pPr>
+            <w:r>
+              <w:t xml:space="preserve">Representante de marca</w:t>
+            </w:r>
+          </w:p>
+        </w:tc>
+        <w:tc>
+          <w:tcPr/>
+          <w:p>
+            <w:pPr>
+              <w:pStyle w:val="Compact"/>
+              <w:jc w:val="left"/>
+            </w:pPr>
+            <w:r>
+              <w:t xml:space="preserve">Marca(s)</w:t>
+            </w:r>
+          </w:p>
+        </w:tc>
+      </w:tr>
+      <w:tr>
+        <w:tc>
+          <w:tcPr/>
+          <w:p>
+            <w:pPr>
+              <w:pStyle w:val="Compact"/>
+              <w:jc w:val="left"/>
+            </w:pPr>
+            <w:r>
+              <w:t xml:space="preserve">1</w:t>
+            </w:r>
+          </w:p>
+        </w:tc>
+        <w:tc>
+          <w:tcPr/>
+          <w:p>
+            <w:pPr>
+              <w:pStyle w:val="Compact"/>
+              <w:jc w:val="left"/>
+            </w:pPr>
+            <w:r>
+              <w:t xml:space="preserve">20609433249</w:t>
+            </w:r>
+          </w:p>
+        </w:tc>
+        <w:tc>
+          <w:tcPr/>
+          <w:p>
+            <w:pPr>
+              <w:pStyle w:val="Compact"/>
+              <w:jc w:val="left"/>
+            </w:pPr>
+            <w:r>
+              <w:t xml:space="preserve">BLUE INTERNATIONAL LOGISTICS E.I.R.L.</w:t>
+            </w:r>
+          </w:p>
+        </w:tc>
+        <w:tc>
+          <w:tcPr/>
+          <w:p>
+            <w:pPr>
+              <w:pStyle w:val="Compact"/>
+              <w:jc w:val="left"/>
+            </w:pPr>
+            <w:r>
+              <w:t xml:space="preserve">ERGOREDA</w:t>
+            </w:r>
+          </w:p>
+        </w:tc>
+      </w:tr>
+      <w:tr>
+        <w:tc>
+          <w:tcPr/>
+          <w:p>
+            <w:pPr>
+              <w:pStyle w:val="Compact"/>
+              <w:jc w:val="left"/>
+            </w:pPr>
+            <w:r>
+              <w:t xml:space="preserve">2</w:t>
+            </w:r>
+          </w:p>
+        </w:tc>
+        <w:tc>
+          <w:tcPr/>
+          <w:p>
+            <w:pPr>
+              <w:pStyle w:val="Compact"/>
+              <w:jc w:val="left"/>
+            </w:pPr>
+            <w:r>
+              <w:t xml:space="preserve">20611697849</w:t>
+            </w:r>
+          </w:p>
+        </w:tc>
+        <w:tc>
+          <w:tcPr/>
+          <w:p>
+            <w:pPr>
+              <w:pStyle w:val="Compact"/>
+              <w:jc w:val="left"/>
+            </w:pPr>
+            <w:r>
+              <w:t xml:space="preserve">ERGONOMIC PERU M &amp; G S.A.C.</w:t>
+            </w:r>
+          </w:p>
+        </w:tc>
+        <w:tc>
+          <w:tcPr/>
+          <w:p>
+            <w:pPr>
+              <w:pStyle w:val="Compact"/>
+              <w:jc w:val="left"/>
+            </w:pPr>
+            <w:r>
+              <w:t xml:space="preserve">M&amp;G ERGONOMIC PERÚ</w:t>
+            </w:r>
+          </w:p>
+        </w:tc>
+      </w:tr>
+      <w:tr>
+        <w:tc>
+          <w:tcPr/>
+          <w:p>
+            <w:pPr>
+              <w:pStyle w:val="Compact"/>
+              <w:jc w:val="left"/>
+            </w:pPr>
+            <w:r>
+              <w:t xml:space="preserve">3</w:t>
+            </w:r>
+          </w:p>
+        </w:tc>
+        <w:tc>
+          <w:tcPr/>
+          <w:p>
+            <w:pPr>
+              <w:pStyle w:val="Compact"/>
+              <w:jc w:val="left"/>
+            </w:pPr>
+            <w:r>
+              <w:t xml:space="preserve">20518903960</w:t>
+            </w:r>
+          </w:p>
+        </w:tc>
+        <w:tc>
+          <w:tcPr/>
+          <w:p>
+            <w:pPr>
+              <w:pStyle w:val="Compact"/>
+              <w:jc w:val="left"/>
+            </w:pPr>
+            <w:r>
+              <w:t xml:space="preserve">IMAX INT’L S.A.C.</w:t>
+            </w:r>
+          </w:p>
+        </w:tc>
+        <w:tc>
+          <w:tcPr/>
+          <w:p>
+            <w:pPr>
+              <w:pStyle w:val="Compact"/>
+              <w:jc w:val="left"/>
+            </w:pPr>
+            <w:r>
+              <w:t xml:space="preserve">ZIYAZ</w:t>
+            </w:r>
+          </w:p>
+        </w:tc>
+      </w:tr>
+      <w:tr>
+        <w:tc>
+          <w:tcPr/>
+          <w:p>
+            <w:pPr>
+              <w:pStyle w:val="Compact"/>
+              <w:jc w:val="left"/>
+            </w:pPr>
+            <w:r>
+              <w:t xml:space="preserve">4</w:t>
+            </w:r>
+          </w:p>
+        </w:tc>
+        <w:tc>
+          <w:tcPr/>
+          <w:p>
+            <w:pPr>
+              <w:pStyle w:val="Compact"/>
+              <w:jc w:val="left"/>
+            </w:pPr>
+            <w:r>
+              <w:t xml:space="preserve">10435658364</w:t>
+            </w:r>
+          </w:p>
+        </w:tc>
+        <w:tc>
+          <w:tcPr/>
+          <w:p>
+            <w:pPr>
+              <w:pStyle w:val="Compact"/>
+              <w:jc w:val="left"/>
+            </w:pPr>
+            <w:r>
+              <w:t xml:space="preserve">MOLLO QUISPECONDORI SERGIO</w:t>
+            </w:r>
+          </w:p>
+        </w:tc>
+        <w:tc>
+          <w:tcPr/>
+          <w:p>
+            <w:pPr>
+              <w:pStyle w:val="Compact"/>
+              <w:jc w:val="left"/>
+            </w:pPr>
+            <w:r>
+              <w:t xml:space="preserve">PITUMARCA</w:t>
+            </w:r>
+          </w:p>
+        </w:tc>
+      </w:tr>
+      <w:tr>
+        <w:tc>
+          <w:tcPr/>
+          <w:p>
+            <w:pPr>
+              <w:pStyle w:val="Compact"/>
+              <w:jc w:val="left"/>
+            </w:pPr>
+            <w:r>
+              <w:t xml:space="preserve">5</w:t>
+            </w:r>
+          </w:p>
+        </w:tc>
+        <w:tc>
+          <w:tcPr/>
+          <w:p>
+            <w:pPr>
+              <w:pStyle w:val="Compact"/>
+              <w:jc w:val="left"/>
+            </w:pPr>
+            <w:r>
+              <w:t xml:space="preserve">20612600156</w:t>
+            </w:r>
+          </w:p>
+        </w:tc>
+        <w:tc>
+          <w:tcPr/>
+          <w:p>
+            <w:pPr>
+              <w:pStyle w:val="Compact"/>
+              <w:jc w:val="left"/>
+            </w:pPr>
+            <w:r>
+              <w:t xml:space="preserve">ROSAS CANCHA SAC</w:t>
+            </w:r>
+          </w:p>
+        </w:tc>
+        <w:tc>
+          <w:tcPr/>
+          <w:p>
+            <w:pPr>
+              <w:pStyle w:val="Compact"/>
+              <w:jc w:val="left"/>
+            </w:pPr>
+            <w:r>
+              <w:t xml:space="preserve">LAUCHUNG SILLAS DE OFICINA</w:t>
+            </w:r>
+          </w:p>
+        </w:tc>
+      </w:tr>
+      <w:tr>
+        <w:tc>
+          <w:tcPr/>
+          <w:p>
+            <w:pPr>
+              <w:pStyle w:val="Compact"/>
+              <w:jc w:val="left"/>
+            </w:pPr>
+            <w:r>
+              <w:t xml:space="preserve">6</w:t>
+            </w:r>
+          </w:p>
+        </w:tc>
+        <w:tc>
+          <w:tcPr/>
+          <w:p>
+            <w:pPr>
+              <w:pStyle w:val="Compact"/>
+              <w:jc w:val="left"/>
+            </w:pPr>
+            <w:r>
+              <w:t xml:space="preserve">20613147901</w:t>
+            </w:r>
+          </w:p>
+        </w:tc>
+        <w:tc>
+          <w:tcPr/>
+          <w:p>
+            <w:pPr>
+              <w:pStyle w:val="Compact"/>
+              <w:jc w:val="left"/>
+            </w:pPr>
+            <w:r>
+              <w:t xml:space="preserve">INVERSIONES ALYMAR E.I.R.L.</w:t>
+            </w:r>
+          </w:p>
+        </w:tc>
+        <w:tc>
+          <w:tcPr/>
+          <w:p>
+            <w:pPr>
+              <w:pStyle w:val="Compact"/>
+              <w:jc w:val="left"/>
+            </w:pPr>
+            <w:r>
+              <w:t xml:space="preserve">ERGOOFI</w:t>
+            </w:r>
+          </w:p>
+        </w:tc>
+      </w:tr>
+      <w:tr>
+        <w:tc>
+          <w:tcPr/>
+          <w:p>
+            <w:pPr>
+              <w:pStyle w:val="Compact"/>
+              <w:jc w:val="left"/>
+            </w:pPr>
+            <w:r>
+              <w:t xml:space="preserve">7</w:t>
+            </w:r>
+          </w:p>
+        </w:tc>
+        <w:tc>
+          <w:tcPr/>
+          <w:p>
+            <w:pPr>
+              <w:pStyle w:val="Compact"/>
+              <w:jc w:val="left"/>
+            </w:pPr>
+            <w:r>
+              <w:t xml:space="preserve">10477007843</w:t>
+            </w:r>
+          </w:p>
+        </w:tc>
+        <w:tc>
+          <w:tcPr/>
+          <w:p>
+            <w:pPr>
+              <w:pStyle w:val="Compact"/>
+              <w:jc w:val="left"/>
+            </w:pPr>
+            <w:r>
+              <w:t xml:space="preserve">JULCA CONDOR SHAROL OSVALDA</w:t>
+            </w:r>
+          </w:p>
+        </w:tc>
+        <w:tc>
+          <w:tcPr/>
+          <w:p>
+            <w:pPr>
+              <w:pStyle w:val="Compact"/>
+              <w:jc w:val="left"/>
+            </w:pPr>
+            <w:r>
+              <w:t xml:space="preserve">MANUSHA</w:t>
+            </w:r>
+          </w:p>
+        </w:tc>
+      </w:tr>
+      <w:tr>
+        <w:tc>
+          <w:tcPr/>
+          <w:p>
+            <w:pPr>
+              <w:pStyle w:val="Compact"/>
+              <w:jc w:val="left"/>
+            </w:pPr>
+            <w:r>
+              <w:t xml:space="preserve">8</w:t>
+            </w:r>
+          </w:p>
+        </w:tc>
+        <w:tc>
+          <w:tcPr/>
+          <w:p>
+            <w:pPr>
+              <w:pStyle w:val="Compact"/>
+              <w:jc w:val="left"/>
+            </w:pPr>
+            <w:r>
+              <w:t xml:space="preserve">10448991968</w:t>
+            </w:r>
+          </w:p>
+        </w:tc>
+        <w:tc>
+          <w:tcPr/>
+          <w:p>
+            <w:pPr>
+              <w:pStyle w:val="Compact"/>
+              <w:jc w:val="left"/>
+            </w:pPr>
+            <w:r>
+              <w:t xml:space="preserve">ZEVALLOS LUNA ARTURO</w:t>
+            </w:r>
+          </w:p>
+        </w:tc>
+        <w:tc>
+          <w:tcPr/>
+          <w:p>
+            <w:pPr>
+              <w:pStyle w:val="Compact"/>
+              <w:jc w:val="left"/>
+            </w:pPr>
+            <w:r>
+              <w:t xml:space="preserve">ZJ ZEJIM</w:t>
+            </w:r>
+          </w:p>
+        </w:tc>
+      </w:tr>
+      <w:tr>
+        <w:tc>
+          <w:tcPr/>
+          <w:p>
+            <w:pPr>
+              <w:pStyle w:val="Compact"/>
+              <w:jc w:val="left"/>
+            </w:pPr>
+            <w:r>
+              <w:t xml:space="preserve">9</w:t>
+            </w:r>
+          </w:p>
+        </w:tc>
+        <w:tc>
+          <w:tcPr/>
+          <w:p>
+            <w:pPr>
+              <w:pStyle w:val="Compact"/>
+              <w:jc w:val="left"/>
+            </w:pPr>
+            <w:r>
+              <w:t xml:space="preserve">20269863626</w:t>
+            </w:r>
+          </w:p>
+        </w:tc>
+        <w:tc>
+          <w:tcPr/>
+          <w:p>
+            <w:pPr>
+              <w:pStyle w:val="Compact"/>
+              <w:jc w:val="left"/>
+            </w:pPr>
+            <w:r>
+              <w:t xml:space="preserve">FORMAT GROUP S.A.</w:t>
+            </w:r>
+          </w:p>
+        </w:tc>
+        <w:tc>
+          <w:tcPr/>
+          <w:p>
+            <w:pPr>
+              <w:pStyle w:val="Compact"/>
+              <w:jc w:val="left"/>
+            </w:pPr>
+            <w:r>
+              <w:t xml:space="preserve">OFFICE SPACE, FURSYS</w:t>
+            </w:r>
+          </w:p>
+        </w:tc>
+      </w:tr>
+      <w:tr>
+        <w:tc>
+          <w:tcPr/>
+          <w:p>
+            <w:pPr>
+              <w:pStyle w:val="Compact"/>
+              <w:jc w:val="left"/>
+            </w:pPr>
+            <w:r>
+              <w:t xml:space="preserve">10</w:t>
+            </w:r>
+          </w:p>
+        </w:tc>
+        <w:tc>
+          <w:tcPr/>
+          <w:p>
+            <w:pPr>
+              <w:pStyle w:val="Compact"/>
+              <w:jc w:val="left"/>
+            </w:pPr>
+            <w:r>
+              <w:t xml:space="preserve">20547892039</w:t>
+            </w:r>
+          </w:p>
+        </w:tc>
+        <w:tc>
+          <w:tcPr/>
+          <w:p>
+            <w:pPr>
+              <w:pStyle w:val="Compact"/>
+              <w:jc w:val="left"/>
+            </w:pPr>
+            <w:r>
+              <w:t xml:space="preserve">TIZIANNI PERU SOCIEDAD ANONIMA</w:t>
+            </w:r>
+          </w:p>
+        </w:tc>
+        <w:tc>
+          <w:tcPr/>
+          <w:p>
+            <w:pPr>
+              <w:pStyle w:val="Compact"/>
+              <w:jc w:val="left"/>
+            </w:pPr>
+            <w:r>
+              <w:t xml:space="preserve">TIZIANNI</w:t>
+            </w:r>
+          </w:p>
+        </w:tc>
+      </w:tr>
+      <w:tr>
+        <w:tc>
+          <w:tcPr/>
+          <w:p>
+            <w:pPr>
+              <w:pStyle w:val="Compact"/>
+              <w:jc w:val="left"/>
+            </w:pPr>
+            <w:r>
+              <w:t xml:space="preserve">11</w:t>
+            </w:r>
+          </w:p>
+        </w:tc>
+        <w:tc>
+          <w:tcPr/>
+          <w:p>
+            <w:pPr>
+              <w:pStyle w:val="Compact"/>
+              <w:jc w:val="left"/>
+            </w:pPr>
+            <w:r>
+              <w:t xml:space="preserve">20605711619</w:t>
+            </w:r>
+          </w:p>
+        </w:tc>
+        <w:tc>
+          <w:tcPr/>
+          <w:p>
+            <w:pPr>
+              <w:pStyle w:val="Compact"/>
+              <w:jc w:val="left"/>
+            </w:pPr>
+            <w:r>
+              <w:t xml:space="preserve">ERGOUNO S.A.</w:t>
+            </w:r>
+          </w:p>
+        </w:tc>
+        <w:tc>
+          <w:tcPr/>
+          <w:p>
+            <w:pPr>
+              <w:pStyle w:val="Compact"/>
+              <w:jc w:val="left"/>
+            </w:pPr>
+            <w:r>
+              <w:t xml:space="preserve">ERGOUNO SILLAS DE OFICINA Y HOGAR</w:t>
+            </w:r>
+          </w:p>
+        </w:tc>
+      </w:tr>
+      <w:tr>
+        <w:tc>
+          <w:tcPr/>
+          <w:p>
+            <w:pPr>
+              <w:pStyle w:val="Compact"/>
+              <w:jc w:val="left"/>
+            </w:pPr>
+            <w:r>
+              <w:t xml:space="preserve">12</w:t>
+            </w:r>
+          </w:p>
+        </w:tc>
+        <w:tc>
+          <w:tcPr/>
+          <w:p>
+            <w:pPr>
+              <w:pStyle w:val="Compact"/>
+              <w:jc w:val="left"/>
+            </w:pPr>
+            <w:r>
+              <w:t xml:space="preserve">20611719818</w:t>
+            </w:r>
+          </w:p>
+        </w:tc>
+        <w:tc>
+          <w:tcPr/>
+          <w:p>
+            <w:pPr>
+              <w:pStyle w:val="Compact"/>
+              <w:jc w:val="left"/>
+            </w:pPr>
+            <w:r>
+              <w:t xml:space="preserve">INVERSIONES ERGOCORP S.A.C.</w:t>
+            </w:r>
+          </w:p>
+        </w:tc>
+        <w:tc>
+          <w:tcPr/>
+          <w:p>
+            <w:pPr>
+              <w:pStyle w:val="Compact"/>
+              <w:jc w:val="left"/>
+            </w:pPr>
+            <w:r>
+              <w:rPr>
+                <w:bCs/>
+                <w:b/>
+              </w:rPr>
+              <w:t xml:space="preserve">EC ERGOCORP</w:t>
+            </w:r>
+          </w:p>
+        </w:tc>
+      </w:tr>
+      <w:tr>
+        <w:tc>
+          <w:tcPr/>
+          <w:p>
+            <w:pPr>
+              <w:pStyle w:val="Compact"/>
+              <w:jc w:val="left"/>
+            </w:pPr>
+            <w:r>
+              <w:t xml:space="preserve">13</w:t>
+            </w:r>
+          </w:p>
+        </w:tc>
+        <w:tc>
+          <w:tcPr/>
+          <w:p>
+            <w:pPr>
+              <w:pStyle w:val="Compact"/>
+              <w:jc w:val="left"/>
+            </w:pPr>
+            <w:r>
+              <w:t xml:space="preserve">20613791222</w:t>
+            </w:r>
+          </w:p>
+        </w:tc>
+        <w:tc>
+          <w:tcPr/>
+          <w:p>
+            <w:pPr>
+              <w:pStyle w:val="Compact"/>
+              <w:jc w:val="left"/>
+            </w:pPr>
+            <w:r>
+              <w:t xml:space="preserve">BUSNESSI PERU E.I.R.L.</w:t>
+            </w:r>
+          </w:p>
+        </w:tc>
+        <w:tc>
+          <w:tcPr/>
+          <w:p>
+            <w:pPr>
+              <w:pStyle w:val="Compact"/>
+              <w:jc w:val="left"/>
+            </w:pPr>
+            <w:r>
+              <w:t xml:space="preserve">BUSNESSI SILLAS Y MUEBLES ERGONÓMICOS</w:t>
+            </w:r>
+          </w:p>
+        </w:tc>
+      </w:tr>
+      <w:tr>
+        <w:tc>
+          <w:tcPr/>
+          <w:p>
+            <w:pPr>
+              <w:pStyle w:val="Compact"/>
+              <w:jc w:val="left"/>
+            </w:pPr>
+            <w:r>
+              <w:t xml:space="preserve">14</w:t>
+            </w:r>
+          </w:p>
+        </w:tc>
+        <w:tc>
+          <w:tcPr/>
+          <w:p>
+            <w:pPr>
+              <w:pStyle w:val="Compact"/>
+              <w:jc w:val="left"/>
+            </w:pPr>
+            <w:r>
+              <w:t xml:space="preserve">20553342181</w:t>
+            </w:r>
+          </w:p>
+        </w:tc>
+        <w:tc>
+          <w:tcPr/>
+          <w:p>
+            <w:pPr>
+              <w:pStyle w:val="Compact"/>
+              <w:jc w:val="left"/>
+            </w:pPr>
+            <w:r>
+              <w:t xml:space="preserve">MACRO UTILES MERCANTIL E.I.R.L.</w:t>
+            </w:r>
+          </w:p>
+        </w:tc>
+        <w:tc>
+          <w:tcPr/>
+          <w:p>
+            <w:pPr>
+              <w:pStyle w:val="Compact"/>
+              <w:jc w:val="left"/>
+            </w:pPr>
+            <w:r>
+              <w:t xml:space="preserve">DA DESING ART</w:t>
+            </w:r>
+          </w:p>
+        </w:tc>
+      </w:tr>
+      <w:tr>
+        <w:tc>
+          <w:tcPr/>
+          <w:p>
+            <w:pPr>
+              <w:pStyle w:val="Compact"/>
+              <w:jc w:val="left"/>
+            </w:pPr>
+            <w:r>
+              <w:t xml:space="preserve">15</w:t>
+            </w:r>
+          </w:p>
+        </w:tc>
+        <w:tc>
+          <w:tcPr/>
+          <w:p>
+            <w:pPr>
+              <w:pStyle w:val="Compact"/>
+              <w:jc w:val="left"/>
+            </w:pPr>
+            <w:r>
+              <w:t xml:space="preserve">20600346289</w:t>
+            </w:r>
+          </w:p>
+        </w:tc>
+        <w:tc>
+          <w:tcPr/>
+          <w:p>
+            <w:pPr>
+              <w:pStyle w:val="Compact"/>
+              <w:jc w:val="left"/>
+            </w:pPr>
+            <w:r>
+              <w:t xml:space="preserve">ARCHITEC S.A.C.</w:t>
+            </w:r>
+          </w:p>
+        </w:tc>
+        <w:tc>
+          <w:tcPr/>
+          <w:p>
+            <w:pPr>
+              <w:pStyle w:val="Compact"/>
+              <w:jc w:val="left"/>
+            </w:pPr>
+            <w:r>
+              <w:rPr>
+                <w:bCs/>
+                <w:b/>
+              </w:rPr>
+              <w:t xml:space="preserve">MOBISEAT</w:t>
+            </w:r>
+            <w:r>
+              <w:t xml:space="preserve">, NOVALUXE</w:t>
+            </w:r>
+          </w:p>
+        </w:tc>
+      </w:tr>
+      <w:tr>
+        <w:tc>
+          <w:tcPr/>
+          <w:p>
+            <w:pPr>
+              <w:pStyle w:val="Compact"/>
+              <w:jc w:val="left"/>
+            </w:pPr>
+            <w:r>
+              <w:t xml:space="preserve">16</w:t>
+            </w:r>
+          </w:p>
+        </w:tc>
+        <w:tc>
+          <w:tcPr/>
+          <w:p>
+            <w:pPr>
+              <w:pStyle w:val="Compact"/>
+              <w:jc w:val="left"/>
+            </w:pPr>
+            <w:r>
+              <w:t xml:space="preserve">20608661701</w:t>
+            </w:r>
+          </w:p>
+        </w:tc>
+        <w:tc>
+          <w:tcPr/>
+          <w:p>
+            <w:pPr>
+              <w:pStyle w:val="Compact"/>
+              <w:jc w:val="left"/>
+            </w:pPr>
+            <w:r>
+              <w:t xml:space="preserve">DICSA PERU E &amp; C S.R.L.</w:t>
+            </w:r>
+          </w:p>
+        </w:tc>
+        <w:tc>
+          <w:tcPr/>
+          <w:p>
+            <w:pPr>
+              <w:pStyle w:val="Compact"/>
+              <w:jc w:val="left"/>
+            </w:pPr>
+            <w:r>
+              <w:t xml:space="preserve">ErgoRelax</w:t>
+            </w:r>
+          </w:p>
+        </w:tc>
+      </w:tr>
+      <w:tr>
+        <w:tc>
+          <w:tcPr/>
+          <w:p>
+            <w:pPr>
+              <w:pStyle w:val="Compact"/>
+              <w:jc w:val="left"/>
+            </w:pPr>
+            <w:r>
+              <w:t xml:space="preserve">17</w:t>
+            </w:r>
+          </w:p>
+        </w:tc>
+        <w:tc>
+          <w:tcPr/>
+          <w:p>
+            <w:pPr>
+              <w:pStyle w:val="Compact"/>
+              <w:jc w:val="left"/>
+            </w:pPr>
+            <w:r>
+              <w:t xml:space="preserve">20613870319</w:t>
+            </w:r>
+          </w:p>
+        </w:tc>
+        <w:tc>
+          <w:tcPr/>
+          <w:p>
+            <w:pPr>
+              <w:pStyle w:val="Compact"/>
+              <w:jc w:val="left"/>
+            </w:pPr>
+            <w:r>
+              <w:t xml:space="preserve">EKOMOBA E.I.R.L.</w:t>
+            </w:r>
+          </w:p>
+        </w:tc>
+        <w:tc>
+          <w:tcPr/>
+          <w:p>
+            <w:pPr>
+              <w:pStyle w:val="Compact"/>
+              <w:jc w:val="left"/>
+            </w:pPr>
+            <w:r>
+              <w:t xml:space="preserve">ECOFAST</w:t>
+            </w:r>
+          </w:p>
+        </w:tc>
+      </w:tr>
+      <w:tr>
+        <w:tc>
+          <w:tcPr/>
+          <w:p>
+            <w:pPr>
+              <w:pStyle w:val="Compact"/>
+              <w:jc w:val="left"/>
+            </w:pPr>
+            <w:r>
+              <w:t xml:space="preserve">18</w:t>
+            </w:r>
+          </w:p>
+        </w:tc>
+        <w:tc>
+          <w:tcPr/>
+          <w:p>
+            <w:pPr>
+              <w:pStyle w:val="Compact"/>
+              <w:jc w:val="left"/>
+            </w:pPr>
+            <w:r>
+              <w:t xml:space="preserve">10733213979</w:t>
+            </w:r>
+          </w:p>
+        </w:tc>
+        <w:tc>
+          <w:tcPr/>
+          <w:p>
+            <w:pPr>
+              <w:pStyle w:val="Compact"/>
+              <w:jc w:val="left"/>
+            </w:pPr>
+            <w:r>
+              <w:t xml:space="preserve">TANANTA HUAMAN ANDY</w:t>
+            </w:r>
+          </w:p>
+        </w:tc>
+        <w:tc>
+          <w:tcPr/>
+          <w:p>
+            <w:pPr>
+              <w:pStyle w:val="Compact"/>
+              <w:jc w:val="left"/>
+            </w:pPr>
+            <w:r>
+              <w:t xml:space="preserve">BLACKGER</w:t>
+            </w:r>
+          </w:p>
+        </w:tc>
+      </w:tr>
+      <w:tr>
+        <w:tc>
+          <w:tcPr/>
+          <w:p>
+            <w:pPr>
+              <w:pStyle w:val="Compact"/>
+              <w:jc w:val="left"/>
+            </w:pPr>
+            <w:r>
+              <w:t xml:space="preserve">19</w:t>
+            </w:r>
+          </w:p>
+        </w:tc>
+        <w:tc>
+          <w:tcPr/>
+          <w:p>
+            <w:pPr>
+              <w:pStyle w:val="Compact"/>
+              <w:jc w:val="left"/>
+            </w:pPr>
+            <w:r>
+              <w:t xml:space="preserve">10737087331</w:t>
+            </w:r>
+          </w:p>
+        </w:tc>
+        <w:tc>
+          <w:tcPr/>
+          <w:p>
+            <w:pPr>
+              <w:pStyle w:val="Compact"/>
+              <w:jc w:val="left"/>
+            </w:pPr>
+            <w:r>
+              <w:t xml:space="preserve">NEGRON RIVA DHALIN</w:t>
+            </w:r>
+          </w:p>
+        </w:tc>
+        <w:tc>
+          <w:tcPr/>
+          <w:p>
+            <w:pPr>
+              <w:pStyle w:val="Compact"/>
+              <w:jc w:val="left"/>
+            </w:pPr>
+            <w:r>
+              <w:t xml:space="preserve">NL NEGRON LOGISTIC</w:t>
+            </w:r>
+          </w:p>
+        </w:tc>
+      </w:tr>
+      <w:tr>
+        <w:tc>
+          <w:tcPr/>
+          <w:p>
+            <w:pPr>
+              <w:pStyle w:val="Compact"/>
+              <w:jc w:val="left"/>
+            </w:pPr>
+            <w:r>
+              <w:t xml:space="preserve">20</w:t>
+            </w:r>
+          </w:p>
+        </w:tc>
+        <w:tc>
+          <w:tcPr/>
+          <w:p>
+            <w:pPr>
+              <w:pStyle w:val="Compact"/>
+              <w:jc w:val="left"/>
+            </w:pPr>
+            <w:r>
+              <w:t xml:space="preserve">20544434391</w:t>
+            </w:r>
+          </w:p>
+        </w:tc>
+        <w:tc>
+          <w:tcPr/>
+          <w:p>
+            <w:pPr>
+              <w:pStyle w:val="Compact"/>
+              <w:jc w:val="left"/>
+            </w:pPr>
+            <w:r>
+              <w:t xml:space="preserve">SERVIMUEBLES CAMIL S.R.L.</w:t>
+            </w:r>
+          </w:p>
+        </w:tc>
+        <w:tc>
+          <w:tcPr/>
+          <w:p>
+            <w:pPr>
+              <w:pStyle w:val="Compact"/>
+              <w:jc w:val="left"/>
+            </w:pPr>
+            <w:r>
+              <w:t xml:space="preserve">B &amp; P, KUSISILLAS</w:t>
+            </w:r>
+          </w:p>
+        </w:tc>
+      </w:tr>
+      <w:tr>
+        <w:tc>
+          <w:tcPr/>
+          <w:p>
+            <w:pPr>
+              <w:pStyle w:val="Compact"/>
+              <w:jc w:val="left"/>
+            </w:pPr>
+            <w:r>
+              <w:t xml:space="preserve">21</w:t>
+            </w:r>
+          </w:p>
+        </w:tc>
+        <w:tc>
+          <w:tcPr/>
+          <w:p>
+            <w:pPr>
+              <w:pStyle w:val="Compact"/>
+              <w:jc w:val="left"/>
+            </w:pPr>
+            <w:r>
+              <w:t xml:space="preserve">20610494715</w:t>
+            </w:r>
+          </w:p>
+        </w:tc>
+        <w:tc>
+          <w:tcPr/>
+          <w:p>
+            <w:pPr>
+              <w:pStyle w:val="Compact"/>
+              <w:jc w:val="left"/>
+            </w:pPr>
+            <w:r>
+              <w:t xml:space="preserve">MEDIAKRON E.I.R.L.</w:t>
+            </w:r>
+          </w:p>
+        </w:tc>
+        <w:tc>
+          <w:tcPr/>
+          <w:p>
+            <w:pPr>
+              <w:pStyle w:val="Compact"/>
+              <w:jc w:val="left"/>
+            </w:pPr>
+            <w:r>
+              <w:t xml:space="preserve">M MOBILUX</w:t>
+            </w:r>
+          </w:p>
+        </w:tc>
+      </w:tr>
+      <w:tr>
+        <w:tc>
+          <w:tcPr/>
+          <w:p>
+            <w:pPr>
+              <w:pStyle w:val="Compact"/>
+              <w:jc w:val="left"/>
+            </w:pPr>
+            <w:r>
+              <w:t xml:space="preserve">22</w:t>
+            </w:r>
+          </w:p>
+        </w:tc>
+        <w:tc>
+          <w:tcPr/>
+          <w:p>
+            <w:pPr>
+              <w:pStyle w:val="Compact"/>
+              <w:jc w:val="left"/>
+            </w:pPr>
+            <w:r>
+              <w:t xml:space="preserve">20611553570</w:t>
+            </w:r>
+          </w:p>
+        </w:tc>
+        <w:tc>
+          <w:tcPr/>
+          <w:p>
+            <w:pPr>
+              <w:pStyle w:val="Compact"/>
+              <w:jc w:val="left"/>
+            </w:pPr>
+            <w:r>
+              <w:t xml:space="preserve">HERSA DEL PERU E.I.R.L.</w:t>
+            </w:r>
+          </w:p>
+        </w:tc>
+        <w:tc>
+          <w:tcPr/>
+          <w:p>
+            <w:pPr>
+              <w:pStyle w:val="Compact"/>
+              <w:jc w:val="left"/>
+            </w:pPr>
+            <w:r>
+              <w:t xml:space="preserve">Hersa del Peru</w:t>
+            </w:r>
+          </w:p>
+        </w:tc>
+      </w:tr>
+      <w:tr>
+        <w:tc>
+          <w:tcPr/>
+          <w:p>
+            <w:pPr>
+              <w:pStyle w:val="Compact"/>
+              <w:jc w:val="left"/>
+            </w:pPr>
+            <w:r>
+              <w:t xml:space="preserve">23</w:t>
+            </w:r>
+          </w:p>
+        </w:tc>
+        <w:tc>
+          <w:tcPr/>
+          <w:p>
+            <w:pPr>
+              <w:pStyle w:val="Compact"/>
+              <w:jc w:val="left"/>
+            </w:pPr>
+            <w:r>
+              <w:t xml:space="preserve">20612676977</w:t>
+            </w:r>
+          </w:p>
+        </w:tc>
+        <w:tc>
+          <w:tcPr/>
+          <w:p>
+            <w:pPr>
+              <w:pStyle w:val="Compact"/>
+              <w:jc w:val="left"/>
+            </w:pPr>
+            <w:r>
+              <w:t xml:space="preserve">IMPORTACION ASIA AMERICA S.A.C.</w:t>
+            </w:r>
+          </w:p>
+        </w:tc>
+        <w:tc>
+          <w:tcPr/>
+          <w:p>
+            <w:pPr>
+              <w:pStyle w:val="Compact"/>
+              <w:jc w:val="left"/>
+            </w:pPr>
+            <w:r>
+              <w:t xml:space="preserve">BLUE CHAIR</w:t>
+            </w:r>
+          </w:p>
+        </w:tc>
+      </w:tr>
+      <w:tr>
+        <w:tc>
+          <w:tcPr/>
+          <w:p>
+            <w:pPr>
+              <w:pStyle w:val="Compact"/>
+              <w:jc w:val="left"/>
+            </w:pPr>
+            <w:r>
+              <w:t xml:space="preserve">24</w:t>
+            </w:r>
+          </w:p>
+        </w:tc>
+        <w:tc>
+          <w:tcPr/>
+          <w:p>
+            <w:pPr>
+              <w:pStyle w:val="Compact"/>
+              <w:jc w:val="left"/>
+            </w:pPr>
+            <w:r>
+              <w:t xml:space="preserve">20606732288</w:t>
+            </w:r>
+          </w:p>
+        </w:tc>
+        <w:tc>
+          <w:tcPr/>
+          <w:p>
+            <w:pPr>
+              <w:pStyle w:val="Compact"/>
+              <w:jc w:val="left"/>
+            </w:pPr>
+            <w:r>
+              <w:t xml:space="preserve">MULTISERVICIOS ALESSIA E.I.R.L.</w:t>
+            </w:r>
+          </w:p>
+        </w:tc>
+        <w:tc>
+          <w:tcPr/>
+          <w:p>
+            <w:pPr>
+              <w:pStyle w:val="Compact"/>
+              <w:jc w:val="left"/>
+            </w:pPr>
+            <w:r>
+              <w:t xml:space="preserve">ALLU</w:t>
+            </w:r>
+          </w:p>
+        </w:tc>
+      </w:tr>
+    </w:tbl>
     <w:bookmarkEnd w:id="37"/>
     <w:sectPr/>
   </w:body>

</xml_diff>

<commit_message>
Queja Bartek: competidores de Desinfectantes con acuerdo formalizado
Co-Authored-By: Claude Opus 5.5 <noreply@anthropic.com>
Claude-Session: https://claude.ai/code/session_01Ls5dNjYBLNjXxuGTDk7v3H
</commit_message>
<xml_diff>
--- a/carta-reclamo/Queja_Bartek_Jefatura_PeruCompras.docx
+++ b/carta-reclamo/Queja_Bartek_Jefatura_PeruCompras.docx
@@ -158,7 +158,7 @@
         <w:jc w:val="both"/>
       </w:pPr>
       <w:r>
-        <w:t xml:space="preserve">Listado oficial de Representantes de Marca con Acuerdo de Adhesión, publicado por PERÚ COMPRAS, actualizado al 22 de octubre de 2026 (Anexo 3).</w:t>
+        <w:t xml:space="preserve">Listado oficial de Representantes de Marca con Acuerdo de Adhesión, publicado por PERÚ COMPRAS, actualizado al 22 de octubre de 2026 – Mobiliario en General y Materiales e Insumos de Limpieza (Anexo 3).</w:t>
       </w:r>
     </w:p>
     <w:p>
@@ -1111,17 +1111,59 @@
         <w:t xml:space="preserve">EC ERGOCORP</w:t>
       </w:r>
       <w:r>
-        <w:t xml:space="preserve">.</w:t>
-      </w:r>
-      <w:r>
-        <w:t xml:space="preserve"> </w:t>
-      </w:r>
-      <w:r>
-        <w:rPr>
-          <w:bCs/>
-          <w:b/>
-        </w:rPr>
-        <w:t xml:space="preserve">SERVICIOS BARTEK E.I.R.L. no figura</w:t>
+        <w:t xml:space="preserve">. Lo mismo ocurre en el Catálogo de</w:t>
+      </w:r>
+      <w:r>
+        <w:t xml:space="preserve"> </w:t>
+      </w:r>
+      <w:r>
+        <w:rPr>
+          <w:bCs/>
+          <w:b/>
+        </w:rPr>
+        <w:t xml:space="preserve">Materiales e Insumos de Limpieza (EXT-CE-2024-3)</w:t>
+      </w:r>
+      <w:r>
+        <w:t xml:space="preserve">: en la categoría</w:t>
+      </w:r>
+      <w:r>
+        <w:t xml:space="preserve"> </w:t>
+      </w:r>
+      <w:r>
+        <w:rPr>
+          <w:bCs/>
+          <w:b/>
+        </w:rPr>
+        <w:t xml:space="preserve">Desinfectantes</w:t>
+      </w:r>
+      <w:r>
+        <w:t xml:space="preserve">, la de SQP-MIKROVAL, ya se formalizó el acuerdo de</w:t>
+      </w:r>
+      <w:r>
+        <w:t xml:space="preserve"> </w:t>
+      </w:r>
+      <w:r>
+        <w:rPr>
+          <w:bCs/>
+          <w:b/>
+        </w:rPr>
+        <w:t xml:space="preserve">cinco (5) representantes de marca</w:t>
+      </w:r>
+      <w:r>
+        <w:t xml:space="preserve"> </w:t>
+      </w:r>
+      <w:r>
+        <w:t xml:space="preserve">competidores.</w:t>
+      </w:r>
+      <w:r>
+        <w:t xml:space="preserve"> </w:t>
+      </w:r>
+      <w:r>
+        <w:rPr>
+          <w:bCs/>
+          <w:b/>
+        </w:rPr>
+        <w:t xml:space="preserve">SERVICIOS BARTEK E.I.R.L. no figura en ninguno de los dos catálogos</w:t>
       </w:r>
       <w:r>
         <w:t xml:space="preserve">, pese a haber cumplido el mismo plazo. Esto vulnera el principio de</w:t>
@@ -1628,7 +1670,7 @@
         <w:t xml:space="preserve"> </w:t>
       </w:r>
       <w:r>
-        <w:t xml:space="preserve">Listado oficial de Representantes de Marca con Acuerdo de Adhesión – Mobiliario en General (al 22/10/2026).</w:t>
+        <w:t xml:space="preserve">Listado oficial de Representantes de Marca con Acuerdo de Adhesión al 22/10/2026 – Mobiliario en General y Desinfectantes.</w:t>
       </w:r>
     </w:p>
     <w:p>
@@ -1881,7 +1923,19 @@
           <w:bCs/>
           <w:b/>
         </w:rPr>
-        <w:t xml:space="preserve">ANEXO 3 – Listado oficial de Representantes de Marca con Acuerdo de Adhesión – Mobiliario en General (EXT-CE-2025-11), actualizado al 22/10/2026</w:t>
+        <w:t xml:space="preserve">ANEXO 3 – Listado oficial de Representantes de Marca con Acuerdo de Adhesión, actualizado al 22/10/2026</w:t>
+      </w:r>
+    </w:p>
+    <w:p>
+      <w:pPr>
+        <w:pStyle w:val="BodyText"/>
+      </w:pPr>
+      <w:r>
+        <w:rPr>
+          <w:bCs/>
+          <w:b/>
+        </w:rPr>
+        <w:t xml:space="preserve">3.1. Mobiliario en General (EXT-CE-2025-11)</w:t>
       </w:r>
     </w:p>
     <w:p>
@@ -3176,6 +3230,353 @@
             </w:pPr>
             <w:r>
               <w:t xml:space="preserve">ALLU</w:t>
+            </w:r>
+          </w:p>
+        </w:tc>
+      </w:tr>
+    </w:tbl>
+    <w:p>
+      <w:pPr>
+        <w:pStyle w:val="BodyText"/>
+      </w:pPr>
+      <w:r>
+        <w:rPr>
+          <w:bCs/>
+          <w:b/>
+        </w:rPr>
+        <w:t xml:space="preserve">3.2. Materiales e Insumos de Limpieza (EXT-CE-2024-3) – categoría Desinfectantes</w:t>
+      </w:r>
+    </w:p>
+    <w:p>
+      <w:pPr>
+        <w:pStyle w:val="BodyText"/>
+      </w:pPr>
+      <w:r>
+        <w:t xml:space="preserve">Fuente: misma página (165 registros del catálogo).</w:t>
+      </w:r>
+      <w:r>
+        <w:t xml:space="preserve"> </w:t>
+      </w:r>
+      <w:r>
+        <w:rPr>
+          <w:bCs/>
+          <w:b/>
+        </w:rPr>
+        <w:t xml:space="preserve">SERVICIOS BARTEK E.I.R.L. no figura.</w:t>
+      </w:r>
+    </w:p>
+    <w:tbl>
+      <w:tblPr>
+        <w:tblStyle w:val="Table"/>
+        <w:tblW w:type="pct" w:w="5000"/>
+        <w:tblLook w:firstRow="1" w:lastRow="0" w:firstColumn="0" w:lastColumn="0" w:noHBand="0" w:noVBand="0" w:val="0020"/>
+        <w:jc w:val="start"/>
+      </w:tblPr>
+      <w:tblGrid>
+        <w:gridCol w:w="424"/>
+        <w:gridCol w:w="1272"/>
+        <w:gridCol w:w="3394"/>
+        <w:gridCol w:w="2828"/>
+      </w:tblGrid>
+      <w:tr>
+        <w:trPr>
+          <w:tblHeader w:val="true"/>
+        </w:trPr>
+        <w:tc>
+          <w:tcPr/>
+          <w:p>
+            <w:pPr>
+              <w:pStyle w:val="Compact"/>
+              <w:jc w:val="left"/>
+            </w:pPr>
+            <w:r>
+              <w:t xml:space="preserve">N.°</w:t>
+            </w:r>
+          </w:p>
+        </w:tc>
+        <w:tc>
+          <w:tcPr/>
+          <w:p>
+            <w:pPr>
+              <w:pStyle w:val="Compact"/>
+              <w:jc w:val="left"/>
+            </w:pPr>
+            <w:r>
+              <w:t xml:space="preserve">RUC</w:t>
+            </w:r>
+          </w:p>
+        </w:tc>
+        <w:tc>
+          <w:tcPr/>
+          <w:p>
+            <w:pPr>
+              <w:pStyle w:val="Compact"/>
+              <w:jc w:val="left"/>
+            </w:pPr>
+            <w:r>
+              <w:t xml:space="preserve">Representante de marca</w:t>
+            </w:r>
+          </w:p>
+        </w:tc>
+        <w:tc>
+          <w:tcPr/>
+          <w:p>
+            <w:pPr>
+              <w:pStyle w:val="Compact"/>
+              <w:jc w:val="left"/>
+            </w:pPr>
+            <w:r>
+              <w:t xml:space="preserve">Marca</w:t>
+            </w:r>
+          </w:p>
+        </w:tc>
+      </w:tr>
+      <w:tr>
+        <w:tc>
+          <w:tcPr/>
+          <w:p>
+            <w:pPr>
+              <w:pStyle w:val="Compact"/>
+              <w:jc w:val="left"/>
+            </w:pPr>
+            <w:r>
+              <w:t xml:space="preserve">1</w:t>
+            </w:r>
+          </w:p>
+        </w:tc>
+        <w:tc>
+          <w:tcPr/>
+          <w:p>
+            <w:pPr>
+              <w:pStyle w:val="Compact"/>
+              <w:jc w:val="left"/>
+            </w:pPr>
+            <w:r>
+              <w:t xml:space="preserve">20550350166</w:t>
+            </w:r>
+          </w:p>
+        </w:tc>
+        <w:tc>
+          <w:tcPr/>
+          <w:p>
+            <w:pPr>
+              <w:pStyle w:val="Compact"/>
+              <w:jc w:val="left"/>
+            </w:pPr>
+            <w:r>
+              <w:t xml:space="preserve">INDUSTRIA &amp; LABORATORIO SOL S.A.C.</w:t>
+            </w:r>
+          </w:p>
+        </w:tc>
+        <w:tc>
+          <w:tcPr/>
+          <w:p>
+            <w:pPr>
+              <w:pStyle w:val="Compact"/>
+              <w:jc w:val="left"/>
+            </w:pPr>
+            <w:r>
+              <w:t xml:space="preserve">SOLGER</w:t>
+            </w:r>
+          </w:p>
+        </w:tc>
+      </w:tr>
+      <w:tr>
+        <w:tc>
+          <w:tcPr/>
+          <w:p>
+            <w:pPr>
+              <w:pStyle w:val="Compact"/>
+              <w:jc w:val="left"/>
+            </w:pPr>
+            <w:r>
+              <w:t xml:space="preserve">2</w:t>
+            </w:r>
+          </w:p>
+        </w:tc>
+        <w:tc>
+          <w:tcPr/>
+          <w:p>
+            <w:pPr>
+              <w:pStyle w:val="Compact"/>
+              <w:jc w:val="left"/>
+            </w:pPr>
+            <w:r>
+              <w:t xml:space="preserve">20479966355</w:t>
+            </w:r>
+          </w:p>
+        </w:tc>
+        <w:tc>
+          <w:tcPr/>
+          <w:p>
+            <w:pPr>
+              <w:pStyle w:val="Compact"/>
+              <w:jc w:val="left"/>
+            </w:pPr>
+            <w:r>
+              <w:t xml:space="preserve">PRODUCTOS LAMOSA S.A.C.</w:t>
+            </w:r>
+          </w:p>
+        </w:tc>
+        <w:tc>
+          <w:tcPr/>
+          <w:p>
+            <w:pPr>
+              <w:pStyle w:val="Compact"/>
+              <w:jc w:val="left"/>
+            </w:pPr>
+            <w:r>
+              <w:t xml:space="preserve">MR. BOOG EL ALIADO DE TU LIMPIEZA</w:t>
+            </w:r>
+          </w:p>
+        </w:tc>
+      </w:tr>
+      <w:tr>
+        <w:tc>
+          <w:tcPr/>
+          <w:p>
+            <w:pPr>
+              <w:pStyle w:val="Compact"/>
+              <w:jc w:val="left"/>
+            </w:pPr>
+            <w:r>
+              <w:t xml:space="preserve">3</w:t>
+            </w:r>
+          </w:p>
+        </w:tc>
+        <w:tc>
+          <w:tcPr/>
+          <w:p>
+            <w:pPr>
+              <w:pStyle w:val="Compact"/>
+              <w:jc w:val="left"/>
+            </w:pPr>
+            <w:r>
+              <w:t xml:space="preserve">20334140645</w:t>
+            </w:r>
+          </w:p>
+        </w:tc>
+        <w:tc>
+          <w:tcPr/>
+          <w:p>
+            <w:pPr>
+              <w:pStyle w:val="Compact"/>
+              <w:jc w:val="left"/>
+            </w:pPr>
+            <w:r>
+              <w:t xml:space="preserve">INDUSTRIAS DALHI S.R.L.</w:t>
+            </w:r>
+          </w:p>
+        </w:tc>
+        <w:tc>
+          <w:tcPr/>
+          <w:p>
+            <w:pPr>
+              <w:pStyle w:val="Compact"/>
+              <w:jc w:val="left"/>
+            </w:pPr>
+            <w:r>
+              <w:t xml:space="preserve">DALHI COMBATIENTES DE LA LIMPIEZA</w:t>
+            </w:r>
+          </w:p>
+        </w:tc>
+      </w:tr>
+      <w:tr>
+        <w:tc>
+          <w:tcPr/>
+          <w:p>
+            <w:pPr>
+              <w:pStyle w:val="Compact"/>
+              <w:jc w:val="left"/>
+            </w:pPr>
+            <w:r>
+              <w:t xml:space="preserve">4</w:t>
+            </w:r>
+          </w:p>
+        </w:tc>
+        <w:tc>
+          <w:tcPr/>
+          <w:p>
+            <w:pPr>
+              <w:pStyle w:val="Compact"/>
+              <w:jc w:val="left"/>
+            </w:pPr>
+            <w:r>
+              <w:t xml:space="preserve">20611606355</w:t>
+            </w:r>
+          </w:p>
+        </w:tc>
+        <w:tc>
+          <w:tcPr/>
+          <w:p>
+            <w:pPr>
+              <w:pStyle w:val="Compact"/>
+              <w:jc w:val="left"/>
+            </w:pPr>
+            <w:r>
+              <w:t xml:space="preserve">BAYONETT S.A.C.</w:t>
+            </w:r>
+          </w:p>
+        </w:tc>
+        <w:tc>
+          <w:tcPr/>
+          <w:p>
+            <w:pPr>
+              <w:pStyle w:val="Compact"/>
+              <w:jc w:val="left"/>
+            </w:pPr>
+            <w:r>
+              <w:t xml:space="preserve">MULTI CLEANER SPECIAL CARE</w:t>
+            </w:r>
+          </w:p>
+        </w:tc>
+      </w:tr>
+      <w:tr>
+        <w:tc>
+          <w:tcPr/>
+          <w:p>
+            <w:pPr>
+              <w:pStyle w:val="Compact"/>
+              <w:jc w:val="left"/>
+            </w:pPr>
+            <w:r>
+              <w:t xml:space="preserve">5</w:t>
+            </w:r>
+          </w:p>
+        </w:tc>
+        <w:tc>
+          <w:tcPr/>
+          <w:p>
+            <w:pPr>
+              <w:pStyle w:val="Compact"/>
+              <w:jc w:val="left"/>
+            </w:pPr>
+            <w:r>
+              <w:t xml:space="preserve">20349751080</w:t>
+            </w:r>
+          </w:p>
+        </w:tc>
+        <w:tc>
+          <w:tcPr/>
+          <w:p>
+            <w:pPr>
+              <w:pStyle w:val="Compact"/>
+              <w:jc w:val="left"/>
+            </w:pPr>
+            <w:r>
+              <w:t xml:space="preserve">SERVICIOS SEÑOR DE HUANCA S.A.</w:t>
+            </w:r>
+          </w:p>
+        </w:tc>
+        <w:tc>
+          <w:tcPr/>
+          <w:p>
+            <w:pPr>
+              <w:pStyle w:val="Compact"/>
+              <w:jc w:val="left"/>
+            </w:pPr>
+            <w:r>
+              <w:t xml:space="preserve">LEONSOL</w:t>
             </w:r>
           </w:p>
         </w:tc>

</xml_diff>

<commit_message>
Queja Bartek: urgencia por el periodo de ofertas del 01 al 09/11
Co-Authored-By: Claude Opus 5.5 <noreply@anthropic.com>
Claude-Session: https://claude.ai/code/session_01Ls5dNjYBLNjXxuGTDk7v3H
</commit_message>
<xml_diff>
--- a/carta-reclamo/Queja_Bartek_Jefatura_PeruCompras.docx
+++ b/carta-reclamo/Queja_Bartek_Jefatura_PeruCompras.docx
@@ -19,7 +19,7 @@
           <w:bCs/>
           <w:b/>
         </w:rPr>
-        <w:t xml:space="preserve">SUMILLA: QUEJA POR DEFECTO DE TRAMITACIÓN</w:t>
+        <w:t xml:space="preserve">SUMILLA: QUEJA POR DEFECTO DE TRAMITACIÓN – URGENTE</w:t>
       </w:r>
     </w:p>
     <w:p>
@@ -986,6 +986,32 @@
         <w:t xml:space="preserve">por una demora que no nos es imputable</w:t>
       </w:r>
       <w:r>
+        <w:t xml:space="preserve">. El próximo periodo de presentación de ofertas de los proveedores es</w:t>
+      </w:r>
+      <w:r>
+        <w:t xml:space="preserve"> </w:t>
+      </w:r>
+      <w:r>
+        <w:rPr>
+          <w:bCs/>
+          <w:b/>
+        </w:rPr>
+        <w:t xml:space="preserve">del 01 al 09 de noviembre de 2026</w:t>
+      </w:r>
+      <w:r>
+        <w:t xml:space="preserve">: si nuestras fichas no se habilitan antes,</w:t>
+      </w:r>
+      <w:r>
+        <w:t xml:space="preserve"> </w:t>
+      </w:r>
+      <w:r>
+        <w:rPr>
+          <w:bCs/>
+          <w:b/>
+        </w:rPr>
+        <w:t xml:space="preserve">perderemos un mes más</w:t>
+      </w:r>
+      <w:r>
         <w:t xml:space="preserve">.</w:t>
       </w:r>
     </w:p>
@@ -1311,7 +1337,20 @@
         <w:t xml:space="preserve"> </w:t>
       </w:r>
       <w:r>
-        <w:t xml:space="preserve">para la presentación de ofertas, y</w:t>
+        <w:t xml:space="preserve">para la presentación de ofertas</w:t>
+      </w:r>
+      <w:r>
+        <w:t xml:space="preserve"> </w:t>
+      </w:r>
+      <w:r>
+        <w:rPr>
+          <w:bCs/>
+          <w:b/>
+        </w:rPr>
+        <w:t xml:space="preserve">antes del 01 de noviembre de 2026</w:t>
+      </w:r>
+      <w:r>
+        <w:t xml:space="preserve">, para que los proveedores puedan ofertarlas en el periodo del 01 al 09 de noviembre, y</w:t>
       </w:r>
       <w:r>
         <w:t xml:space="preserve"> </w:t>

</xml_diff>

<commit_message>
Queja Bartek: número de carta 26102026-1 y asunto
Co-Authored-By: Claude Opus 5.5 <noreply@anthropic.com>
Claude-Session: https://claude.ai/code/session_01Ls5dNjYBLNjXxuGTDk7v3H
</commit_message>
<xml_diff>
--- a/carta-reclamo/Queja_Bartek_Jefatura_PeruCompras.docx
+++ b/carta-reclamo/Queja_Bartek_Jefatura_PeruCompras.docx
@@ -19,7 +19,7 @@
           <w:bCs/>
           <w:b/>
         </w:rPr>
-        <w:t xml:space="preserve">SUMILLA: QUEJA POR DEFECTO DE TRAMITACIÓN – URGENTE</w:t>
+        <w:t xml:space="preserve">CARTA N.° 26102026-1-SERVICIOS BARTEK E.I.R.L.</w:t>
       </w:r>
     </w:p>
     <w:p>
@@ -66,6 +66,67 @@
       </w:r>
       <w:r>
         <w:t xml:space="preserve">Presente.–</w:t>
+      </w:r>
+    </w:p>
+    <w:p>
+      <w:pPr>
+        <w:pStyle w:val="BodyText"/>
+        <w:jc w:val="both"/>
+      </w:pPr>
+      <w:r>
+        <w:rPr>
+          <w:bCs/>
+          <w:b/>
+        </w:rPr>
+        <w:t xml:space="preserve">ASUNTO:</w:t>
+      </w:r>
+      <w:r>
+        <w:t xml:space="preserve"> </w:t>
+      </w:r>
+      <w:r>
+        <w:t xml:space="preserve">QUEJA POR DEFECTO DE TRAMITACIÓN –</w:t>
+      </w:r>
+      <w:r>
+        <w:t xml:space="preserve"> </w:t>
+      </w:r>
+      <w:r>
+        <w:rPr>
+          <w:bCs/>
+          <w:b/>
+        </w:rPr>
+        <w:t xml:space="preserve">URGENTE</w:t>
+      </w:r>
+      <w:r>
+        <w:t xml:space="preserve">. Paralización de la formalización del Acuerdo de Adhesión de SERVICIOS BARTEK E.I.R.L. y bloqueo de sus Fichas-Producto</w:t>
+      </w:r>
+      <w:r>
+        <w:t xml:space="preserve"> </w:t>
+      </w:r>
+      <w:r>
+        <w:rPr>
+          <w:bCs/>
+          <w:b/>
+        </w:rPr>
+        <w:t xml:space="preserve">MOBIS</w:t>
+      </w:r>
+      <w:r>
+        <w:t xml:space="preserve"> </w:t>
+      </w:r>
+      <w:r>
+        <w:t xml:space="preserve">y</w:t>
+      </w:r>
+      <w:r>
+        <w:t xml:space="preserve"> </w:t>
+      </w:r>
+      <w:r>
+        <w:rPr>
+          <w:bCs/>
+          <w:b/>
+        </w:rPr>
+        <w:t xml:space="preserve">SQP-MIKROVAL</w:t>
+      </w:r>
+      <w:r>
+        <w:t xml:space="preserve">, ante el periodo de ofertas del 01 al 09 de noviembre de 2026.</w:t>
       </w:r>
     </w:p>
     <w:p>
@@ -162,13 +223,6 @@
       </w:r>
     </w:p>
     <w:p>
-      <w:r>
-        <w:pict>
-          <v:rect style="width:0;height:1.5pt" o:hralign="center" o:hrstd="t" o:hr="t"/>
-        </w:pict>
-      </w:r>
-    </w:p>
-    <w:p>
       <w:pPr>
         <w:pStyle w:val="FirstParagraph"/>
         <w:jc w:val="both"/>
@@ -1562,7 +1616,7 @@
       <w:r>
         <w:drawing>
           <wp:inline>
-            <wp:extent cx="1979999" cy="884849"/>
+            <wp:extent cx="1727999" cy="772232"/>
             <wp:effectExtent b="0" l="0" r="0" t="0"/>
             <wp:docPr descr="" title="" id="23" name="Picture"/>
             <a:graphic>
@@ -1583,7 +1637,7 @@
                   <pic:spPr bwMode="auto">
                     <a:xfrm>
                       <a:off x="0" y="0"/>
-                      <a:ext cx="1979999" cy="884849"/>
+                      <a:ext cx="1727999" cy="772232"/>
                     </a:xfrm>
                     <a:prstGeom prst="rect">
                       <a:avLst/>
@@ -1617,19 +1671,7 @@
         <w:t xml:space="preserve"> </w:t>
       </w:r>
       <w:r>
-        <w:t xml:space="preserve">– RUC N.° 20610900551</w:t>
-      </w:r>
-      <w:r>
-        <w:br/>
-      </w:r>
-      <w:r>
-        <w:t xml:space="preserve">Gerente: Faviola Matilde Orihuela Pimentel</w:t>
-      </w:r>
-      <w:r>
-        <w:br/>
-      </w:r>
-      <w:r>
-        <w:t xml:space="preserve">Correo: serviciosbartek@gmail.com</w:t>
+        <w:t xml:space="preserve">– RUC N.° 20610900551 · Correo: serviciosbartek@gmail.com</w:t>
       </w:r>
     </w:p>
     <w:p>
@@ -1673,7 +1715,6 @@
           <w:numId w:val="1004"/>
         </w:numPr>
         <w:pStyle w:val="Compact"/>
-        <w:jc w:val="both"/>
       </w:pPr>
       <w:r>
         <w:rPr>
@@ -1686,7 +1727,7 @@
         <w:t xml:space="preserve"> </w:t>
       </w:r>
       <w:r>
-        <w:t xml:space="preserve">Observaciones del 29/09/2026 a las fichas SQP-MIKROVAL N.° 2007274, 2298513 y 2298514.</w:t>
+        <w:t xml:space="preserve">Observaciones a las fichas SQP-MIKROVAL (29/09/2026).</w:t>
       </w:r>
     </w:p>
     <w:p>
@@ -1696,7 +1737,6 @@
           <w:numId w:val="1004"/>
         </w:numPr>
         <w:pStyle w:val="Compact"/>
-        <w:jc w:val="both"/>
       </w:pPr>
       <w:r>
         <w:rPr>
@@ -1709,7 +1749,7 @@
         <w:t xml:space="preserve"> </w:t>
       </w:r>
       <w:r>
-        <w:t xml:space="preserve">Listado oficial de Representantes de Marca con Acuerdo de Adhesión al 22/10/2026 – Mobiliario en General y Desinfectantes.</w:t>
+        <w:t xml:space="preserve">Listado oficial de Representantes de Marca con Acuerdo de Adhesión (22/10/2026).</w:t>
       </w:r>
     </w:p>
     <w:p>

</xml_diff>